<commit_message>
keys files were updated
</commit_message>
<xml_diff>
--- a/Jadeed_Kashtkar_Deployment_Guide(Updated).docx
+++ b/Jadeed_Kashtkar_Deployment_Guide(Updated).docx
@@ -1587,18 +1587,36 @@
                 <w:sz w:val="18"/>
                 <w:szCs w:val="18"/>
               </w:rPr>
-              <w:t>git clone https://github.com/Areesha-008/Agri_project.git</w:t>
-            </w:r>
-          </w:p>
-          <w:p>
-            <w:r>
-              <w:rPr>
-                <w:rFonts w:ascii="Consolas" w:eastAsia="Consolas" w:hAnsi="Consolas" w:cs="Consolas"/>
-                <w:color w:val="1A1A1A"/>
-                <w:sz w:val="18"/>
-                <w:szCs w:val="18"/>
-              </w:rPr>
-              <w:t>cd Agri_project</w:t>
+              <w:t xml:space="preserve">git clone </w:t>
+            </w:r>
+            <w:r>
+              <w:rPr>
+                <w:rFonts w:ascii="Consolas" w:eastAsia="Consolas" w:hAnsi="Consolas" w:cs="Consolas"/>
+                <w:color w:val="1A1A1A"/>
+                <w:sz w:val="18"/>
+                <w:szCs w:val="18"/>
+              </w:rPr>
+              <w:t>https://github.com/qadrikazmi/jadeedkashtkar.git</w:t>
+            </w:r>
+          </w:p>
+          <w:p>
+            <w:r>
+              <w:rPr>
+                <w:rFonts w:ascii="Consolas" w:eastAsia="Consolas" w:hAnsi="Consolas" w:cs="Consolas"/>
+                <w:color w:val="1A1A1A"/>
+                <w:sz w:val="18"/>
+                <w:szCs w:val="18"/>
+              </w:rPr>
+              <w:t xml:space="preserve">cd </w:t>
+            </w:r>
+            <w:r>
+              <w:rPr>
+                <w:rFonts w:ascii="Consolas" w:eastAsia="Consolas" w:hAnsi="Consolas" w:cs="Consolas"/>
+                <w:color w:val="1A1A1A"/>
+                <w:sz w:val="18"/>
+                <w:szCs w:val="18"/>
+              </w:rPr>
+              <w:t>jadeedkashtkar</w:t>
             </w:r>
           </w:p>
         </w:tc>
@@ -2239,7 +2257,25 @@
                 <w:sz w:val="18"/>
                 <w:szCs w:val="18"/>
               </w:rPr>
-              <w:t>nano ~/nginx-proxy/conf.d/agri-project.conf</w:t>
+              <w:t>nano ~/nginx-proxy/conf.d/</w:t>
+            </w:r>
+            <w:r>
+              <w:rPr>
+                <w:rFonts w:ascii="Consolas" w:eastAsia="Consolas" w:hAnsi="Consolas" w:cs="Consolas"/>
+                <w:color w:val="1A1A1A"/>
+                <w:sz w:val="18"/>
+                <w:szCs w:val="18"/>
+              </w:rPr>
+              <w:t>jadeedkashtkar</w:t>
+            </w:r>
+            <w:r>
+              <w:rPr>
+                <w:rFonts w:ascii="Consolas" w:eastAsia="Consolas" w:hAnsi="Consolas" w:cs="Consolas"/>
+                <w:color w:val="1A1A1A"/>
+                <w:sz w:val="18"/>
+                <w:szCs w:val="18"/>
+              </w:rPr>
+              <w:t>.conf</w:t>
             </w:r>
           </w:p>
         </w:tc>
@@ -2406,7 +2442,34 @@
                 <w:sz w:val="18"/>
                 <w:szCs w:val="18"/>
               </w:rPr>
-              <w:t xml:space="preserve">    location / {</w:t>
+              <w:t xml:space="preserve">    location </w:t>
+            </w:r>
+            <w:r>
+              <w:rPr>
+                <w:rFonts w:ascii="Consolas" w:eastAsia="Consolas" w:hAnsi="Consolas" w:cs="Consolas"/>
+                <w:color w:val="1A1A1A"/>
+                <w:sz w:val="18"/>
+                <w:szCs w:val="18"/>
+              </w:rPr>
+              <w:t>/</w:t>
+            </w:r>
+            <w:r>
+              <w:rPr>
+                <w:rFonts w:ascii="Consolas" w:eastAsia="Consolas" w:hAnsi="Consolas" w:cs="Consolas"/>
+                <w:color w:val="1A1A1A"/>
+                <w:sz w:val="18"/>
+                <w:szCs w:val="18"/>
+              </w:rPr>
+              <w:t>jadeedkashtkar</w:t>
+            </w:r>
+            <w:r>
+              <w:rPr>
+                <w:rFonts w:ascii="Consolas" w:eastAsia="Consolas" w:hAnsi="Consolas" w:cs="Consolas"/>
+                <w:color w:val="1A1A1A"/>
+                <w:sz w:val="18"/>
+                <w:szCs w:val="18"/>
+              </w:rPr>
+              <w:t xml:space="preserve"> {</w:t>
             </w:r>
           </w:p>
           <w:p>
@@ -4014,7 +4077,7 @@
         <w:color w:val="2B2B2B"/>
         <w:sz w:val="21"/>
         <w:szCs w:val="21"/>
-        <w:lang w:bidi="ar-SA"/>
+        <w:lang w:val="en-US" w:eastAsia="en-US" w:bidi="ar-SA"/>
       </w:rPr>
     </w:rPrDefault>
     <w:pPrDefault/>
@@ -4612,6 +4675,18 @@
       <w:szCs w:val="20"/>
     </w:rPr>
   </w:style>
+  <w:style w:type="character" w:styleId="UnresolvedMention">
+    <w:name w:val="Unresolved Mention"/>
+    <w:basedOn w:val="DefaultParagraphFont"/>
+    <w:uiPriority w:val="99"/>
+    <w:semiHidden/>
+    <w:unhideWhenUsed/>
+    <w:rsid w:val="006A473E"/>
+    <w:rPr>
+      <w:color w:val="605E5C"/>
+      <w:shd w:val="clear" w:color="auto" w:fill="E1DFDD"/>
+    </w:rPr>
+  </w:style>
 </w:styles>
 </file>
 

</xml_diff>